<commit_message>
add file visualize dataset
</commit_message>
<xml_diff>
--- a/embedding_project/outputs/evaluation/bao_cao_thu_nghiem_e5_base_hoan_chinh.docx
+++ b/embedding_project/outputs/evaluation/bao_cao_thu_nghiem_e5_base_hoan_chinh.docx
@@ -612,7 +612,7 @@
           <w:szCs w:val="28"/>
         </w:rPr>
         <w:drawing>
-          <wp:inline distT="0" distB="0" distL="0" distR="0" wp14:anchorId="37821B94" wp14:editId="1568C85F">
+          <wp:inline distT="0" distB="0" distL="0" distR="0" wp14:anchorId="5F79F118" wp14:editId="64231609">
             <wp:extent cx="5303520" cy="2618193"/>
             <wp:effectExtent l="0" t="0" r="0" b="0"/>
             <wp:docPr id="1" name="Picture 1"/>
@@ -960,7 +960,25 @@
           <w:sz w:val="28"/>
           <w:szCs w:val="28"/>
         </w:rPr>
-        <w:t>4.2. Fine-tuned 2 epoch  (e5_base_finetuned_2ep_final)</w:t>
+        <w:t xml:space="preserve">4.2. Fine-tuned 2 epoch </w:t>
+      </w:r>
+      <w:r>
+        <w:rPr>
+          <w:rFonts w:ascii="Segoe UI Emoji" w:hAnsi="Segoe UI Emoji" w:cs="Segoe UI Emoji"/>
+          <w:color w:val="auto"/>
+          <w:sz w:val="28"/>
+          <w:szCs w:val="28"/>
+        </w:rPr>
+        <w:t>🏆</w:t>
+      </w:r>
+      <w:r>
+        <w:rPr>
+          <w:rFonts w:ascii="Times New Roman" w:hAnsi="Times New Roman" w:cs="Times New Roman"/>
+          <w:color w:val="auto"/>
+          <w:sz w:val="28"/>
+          <w:szCs w:val="28"/>
+        </w:rPr>
+        <w:t xml:space="preserve"> (e5_base_finetuned_2ep_final)</w:t>
       </w:r>
     </w:p>
     <w:tbl>
@@ -3321,7 +3339,1991 @@
           <w:rFonts w:ascii="Times New Roman" w:hAnsi="Times New Roman" w:cs="Times New Roman"/>
           <w:color w:val="auto"/>
         </w:rPr>
-        <w:t>7. Kết luận và khuyến nghị</w:t>
+        <w:t>7. Cải tiến pipeline đã triển khai (giai đoạn 2)</w:t>
+      </w:r>
+    </w:p>
+    <w:p>
+      <w:pPr>
+        <w:rPr>
+          <w:rFonts w:ascii="Times New Roman" w:hAnsi="Times New Roman" w:cs="Times New Roman"/>
+          <w:sz w:val="28"/>
+          <w:szCs w:val="28"/>
+        </w:rPr>
+      </w:pPr>
+      <w:r>
+        <w:rPr>
+          <w:rFonts w:ascii="Times New Roman" w:hAnsi="Times New Roman" w:cs="Times New Roman"/>
+          <w:sz w:val="28"/>
+          <w:szCs w:val="28"/>
+        </w:rPr>
+        <w:t>Sau khi phát hiện metric test_cleaned lạc quan nhưng query thực tế vẫn fail, đã triển khai chuỗi cải tiến: làm sạch train → mine hard negative có kiểm soát → fine-tune bổ sung bằng TripletLoss từ checkpoint 1 epoch (ít overfit hơn 2 epoch).</w:t>
+      </w:r>
+    </w:p>
+    <w:p>
+      <w:pPr>
+        <w:pStyle w:val="Heading2"/>
+        <w:rPr>
+          <w:rFonts w:ascii="Times New Roman" w:hAnsi="Times New Roman" w:cs="Times New Roman"/>
+          <w:color w:val="auto"/>
+          <w:sz w:val="28"/>
+          <w:szCs w:val="28"/>
+        </w:rPr>
+      </w:pPr>
+      <w:r>
+        <w:rPr>
+          <w:rFonts w:ascii="Times New Roman" w:hAnsi="Times New Roman" w:cs="Times New Roman"/>
+          <w:color w:val="auto"/>
+          <w:sz w:val="28"/>
+          <w:szCs w:val="28"/>
+        </w:rPr>
+        <w:t>7.1. Làm sạch dữ liệu huấn luyện (train_cleaned_v2)</w:t>
+      </w:r>
+    </w:p>
+    <w:p>
+      <w:pPr>
+        <w:rPr>
+          <w:rFonts w:ascii="Times New Roman" w:hAnsi="Times New Roman" w:cs="Times New Roman"/>
+          <w:sz w:val="28"/>
+          <w:szCs w:val="28"/>
+        </w:rPr>
+      </w:pPr>
+      <w:r>
+        <w:rPr>
+          <w:rFonts w:ascii="Times New Roman" w:hAnsi="Times New Roman" w:cs="Times New Roman"/>
+          <w:sz w:val="28"/>
+          <w:szCs w:val="28"/>
+        </w:rPr>
+        <w:t>Script: embedding_project/scripts/clean_train_intent_v2.py</w:t>
+      </w:r>
+    </w:p>
+    <w:tbl>
+      <w:tblPr>
+        <w:tblStyle w:val="TableGrid"/>
+        <w:tblW w:w="0" w:type="auto"/>
+        <w:tblLook w:val="04A0" w:firstRow="1" w:lastRow="0" w:firstColumn="1" w:lastColumn="0" w:noHBand="0" w:noVBand="1"/>
+      </w:tblPr>
+      <w:tblGrid>
+        <w:gridCol w:w="2806"/>
+        <w:gridCol w:w="2028"/>
+        <w:gridCol w:w="2022"/>
+        <w:gridCol w:w="2000"/>
+      </w:tblGrid>
+      <w:tr>
+        <w:tc>
+          <w:tcPr>
+            <w:tcW w:w="2160" w:type="dxa"/>
+          </w:tcPr>
+          <w:p>
+            <w:pPr>
+              <w:rPr>
+                <w:rFonts w:ascii="Times New Roman" w:hAnsi="Times New Roman" w:cs="Times New Roman"/>
+                <w:sz w:val="28"/>
+                <w:szCs w:val="28"/>
+              </w:rPr>
+            </w:pPr>
+            <w:r>
+              <w:rPr>
+                <w:rFonts w:ascii="Times New Roman" w:hAnsi="Times New Roman" w:cs="Times New Roman"/>
+                <w:sz w:val="28"/>
+                <w:szCs w:val="28"/>
+              </w:rPr>
+              <w:t>Tập</w:t>
+            </w:r>
+          </w:p>
+        </w:tc>
+        <w:tc>
+          <w:tcPr>
+            <w:tcW w:w="2160" w:type="dxa"/>
+          </w:tcPr>
+          <w:p>
+            <w:pPr>
+              <w:rPr>
+                <w:rFonts w:ascii="Times New Roman" w:hAnsi="Times New Roman" w:cs="Times New Roman"/>
+                <w:sz w:val="28"/>
+                <w:szCs w:val="28"/>
+              </w:rPr>
+            </w:pPr>
+            <w:r>
+              <w:rPr>
+                <w:rFonts w:ascii="Times New Roman" w:hAnsi="Times New Roman" w:cs="Times New Roman"/>
+                <w:sz w:val="28"/>
+                <w:szCs w:val="28"/>
+              </w:rPr>
+              <w:t>Trước</w:t>
+            </w:r>
+          </w:p>
+        </w:tc>
+        <w:tc>
+          <w:tcPr>
+            <w:tcW w:w="2160" w:type="dxa"/>
+          </w:tcPr>
+          <w:p>
+            <w:pPr>
+              <w:rPr>
+                <w:rFonts w:ascii="Times New Roman" w:hAnsi="Times New Roman" w:cs="Times New Roman"/>
+                <w:sz w:val="28"/>
+                <w:szCs w:val="28"/>
+              </w:rPr>
+            </w:pPr>
+            <w:r>
+              <w:rPr>
+                <w:rFonts w:ascii="Times New Roman" w:hAnsi="Times New Roman" w:cs="Times New Roman"/>
+                <w:sz w:val="28"/>
+                <w:szCs w:val="28"/>
+              </w:rPr>
+              <w:t>Sau</w:t>
+            </w:r>
+          </w:p>
+        </w:tc>
+        <w:tc>
+          <w:tcPr>
+            <w:tcW w:w="2160" w:type="dxa"/>
+          </w:tcPr>
+          <w:p>
+            <w:pPr>
+              <w:rPr>
+                <w:rFonts w:ascii="Times New Roman" w:hAnsi="Times New Roman" w:cs="Times New Roman"/>
+                <w:sz w:val="28"/>
+                <w:szCs w:val="28"/>
+              </w:rPr>
+            </w:pPr>
+            <w:r>
+              <w:rPr>
+                <w:rFonts w:ascii="Times New Roman" w:hAnsi="Times New Roman" w:cs="Times New Roman"/>
+                <w:sz w:val="28"/>
+                <w:szCs w:val="28"/>
+              </w:rPr>
+              <w:t>Đã loại</w:t>
+            </w:r>
+          </w:p>
+        </w:tc>
+      </w:tr>
+      <w:tr>
+        <w:tc>
+          <w:tcPr>
+            <w:tcW w:w="2160" w:type="dxa"/>
+          </w:tcPr>
+          <w:p>
+            <w:pPr>
+              <w:rPr>
+                <w:rFonts w:ascii="Times New Roman" w:hAnsi="Times New Roman" w:cs="Times New Roman"/>
+                <w:sz w:val="28"/>
+                <w:szCs w:val="28"/>
+              </w:rPr>
+            </w:pPr>
+            <w:r>
+              <w:rPr>
+                <w:rFonts w:ascii="Times New Roman" w:hAnsi="Times New Roman" w:cs="Times New Roman"/>
+                <w:sz w:val="28"/>
+                <w:szCs w:val="28"/>
+              </w:rPr>
+              <w:t>train_cleaned_v2.jsonl</w:t>
+            </w:r>
+          </w:p>
+        </w:tc>
+        <w:tc>
+          <w:tcPr>
+            <w:tcW w:w="2160" w:type="dxa"/>
+          </w:tcPr>
+          <w:p>
+            <w:pPr>
+              <w:rPr>
+                <w:rFonts w:ascii="Times New Roman" w:hAnsi="Times New Roman" w:cs="Times New Roman"/>
+                <w:sz w:val="28"/>
+                <w:szCs w:val="28"/>
+              </w:rPr>
+            </w:pPr>
+            <w:r>
+              <w:rPr>
+                <w:rFonts w:ascii="Times New Roman" w:hAnsi="Times New Roman" w:cs="Times New Roman"/>
+                <w:sz w:val="28"/>
+                <w:szCs w:val="28"/>
+              </w:rPr>
+              <w:t>6.224</w:t>
+            </w:r>
+          </w:p>
+        </w:tc>
+        <w:tc>
+          <w:tcPr>
+            <w:tcW w:w="2160" w:type="dxa"/>
+          </w:tcPr>
+          <w:p>
+            <w:pPr>
+              <w:rPr>
+                <w:rFonts w:ascii="Times New Roman" w:hAnsi="Times New Roman" w:cs="Times New Roman"/>
+                <w:sz w:val="28"/>
+                <w:szCs w:val="28"/>
+              </w:rPr>
+            </w:pPr>
+            <w:r>
+              <w:rPr>
+                <w:rFonts w:ascii="Times New Roman" w:hAnsi="Times New Roman" w:cs="Times New Roman"/>
+                <w:sz w:val="28"/>
+                <w:szCs w:val="28"/>
+              </w:rPr>
+              <w:t>6.071</w:t>
+            </w:r>
+          </w:p>
+        </w:tc>
+        <w:tc>
+          <w:tcPr>
+            <w:tcW w:w="2160" w:type="dxa"/>
+          </w:tcPr>
+          <w:p>
+            <w:pPr>
+              <w:rPr>
+                <w:rFonts w:ascii="Times New Roman" w:hAnsi="Times New Roman" w:cs="Times New Roman"/>
+                <w:sz w:val="28"/>
+                <w:szCs w:val="28"/>
+              </w:rPr>
+            </w:pPr>
+            <w:r>
+              <w:rPr>
+                <w:rFonts w:ascii="Times New Roman" w:hAnsi="Times New Roman" w:cs="Times New Roman"/>
+                <w:sz w:val="28"/>
+                <w:szCs w:val="28"/>
+              </w:rPr>
+              <w:t>153 cặp</w:t>
+            </w:r>
+          </w:p>
+        </w:tc>
+      </w:tr>
+      <w:tr>
+        <w:tc>
+          <w:tcPr>
+            <w:tcW w:w="2160" w:type="dxa"/>
+          </w:tcPr>
+          <w:p>
+            <w:pPr>
+              <w:rPr>
+                <w:rFonts w:ascii="Times New Roman" w:hAnsi="Times New Roman" w:cs="Times New Roman"/>
+                <w:sz w:val="28"/>
+                <w:szCs w:val="28"/>
+              </w:rPr>
+            </w:pPr>
+            <w:r>
+              <w:rPr>
+                <w:rFonts w:ascii="Times New Roman" w:hAnsi="Times New Roman" w:cs="Times New Roman"/>
+                <w:sz w:val="28"/>
+                <w:szCs w:val="28"/>
+              </w:rPr>
+              <w:t>valid_cleaned_v2.jsonl</w:t>
+            </w:r>
+          </w:p>
+        </w:tc>
+        <w:tc>
+          <w:tcPr>
+            <w:tcW w:w="2160" w:type="dxa"/>
+          </w:tcPr>
+          <w:p>
+            <w:pPr>
+              <w:rPr>
+                <w:rFonts w:ascii="Times New Roman" w:hAnsi="Times New Roman" w:cs="Times New Roman"/>
+                <w:sz w:val="28"/>
+                <w:szCs w:val="28"/>
+              </w:rPr>
+            </w:pPr>
+            <w:r>
+              <w:rPr>
+                <w:rFonts w:ascii="Times New Roman" w:hAnsi="Times New Roman" w:cs="Times New Roman"/>
+                <w:sz w:val="28"/>
+                <w:szCs w:val="28"/>
+              </w:rPr>
+              <w:t>778</w:t>
+            </w:r>
+          </w:p>
+        </w:tc>
+        <w:tc>
+          <w:tcPr>
+            <w:tcW w:w="2160" w:type="dxa"/>
+          </w:tcPr>
+          <w:p>
+            <w:pPr>
+              <w:rPr>
+                <w:rFonts w:ascii="Times New Roman" w:hAnsi="Times New Roman" w:cs="Times New Roman"/>
+                <w:sz w:val="28"/>
+                <w:szCs w:val="28"/>
+              </w:rPr>
+            </w:pPr>
+            <w:r>
+              <w:rPr>
+                <w:rFonts w:ascii="Times New Roman" w:hAnsi="Times New Roman" w:cs="Times New Roman"/>
+                <w:sz w:val="28"/>
+                <w:szCs w:val="28"/>
+              </w:rPr>
+              <w:t>761</w:t>
+            </w:r>
+          </w:p>
+        </w:tc>
+        <w:tc>
+          <w:tcPr>
+            <w:tcW w:w="2160" w:type="dxa"/>
+          </w:tcPr>
+          <w:p>
+            <w:pPr>
+              <w:rPr>
+                <w:rFonts w:ascii="Times New Roman" w:hAnsi="Times New Roman" w:cs="Times New Roman"/>
+                <w:sz w:val="28"/>
+                <w:szCs w:val="28"/>
+              </w:rPr>
+            </w:pPr>
+            <w:r>
+              <w:rPr>
+                <w:rFonts w:ascii="Times New Roman" w:hAnsi="Times New Roman" w:cs="Times New Roman"/>
+                <w:sz w:val="28"/>
+                <w:szCs w:val="28"/>
+              </w:rPr>
+              <w:t>17 cặp</w:t>
+            </w:r>
+          </w:p>
+        </w:tc>
+      </w:tr>
+    </w:tbl>
+    <w:p>
+      <w:pPr>
+        <w:rPr>
+          <w:rFonts w:ascii="Times New Roman" w:hAnsi="Times New Roman" w:cs="Times New Roman"/>
+          <w:sz w:val="28"/>
+          <w:szCs w:val="28"/>
+        </w:rPr>
+      </w:pPr>
+      <w:r>
+        <w:rPr>
+          <w:rFonts w:ascii="Times New Roman" w:hAnsi="Times New Roman" w:cs="Times New Roman"/>
+          <w:sz w:val="28"/>
+          <w:szCs w:val="28"/>
+        </w:rPr>
+        <w:t>Các nhóm cặp bị loại (train):</w:t>
+      </w:r>
+    </w:p>
+    <w:p>
+      <w:pPr>
+        <w:pStyle w:val="ListBullet"/>
+        <w:rPr>
+          <w:rFonts w:ascii="Times New Roman" w:hAnsi="Times New Roman" w:cs="Times New Roman"/>
+          <w:sz w:val="28"/>
+          <w:szCs w:val="28"/>
+        </w:rPr>
+      </w:pPr>
+      <w:r>
+        <w:rPr>
+          <w:rFonts w:ascii="Times New Roman" w:hAnsi="Times New Roman" w:cs="Times New Roman"/>
+          <w:sz w:val="28"/>
+          <w:szCs w:val="28"/>
+        </w:rPr>
+        <w:t>pet_product_human_query (119): query người nhưng positive là đồ thú cưng.</w:t>
+      </w:r>
+    </w:p>
+    <w:p>
+      <w:pPr>
+        <w:pStyle w:val="ListBullet"/>
+        <w:rPr>
+          <w:rFonts w:ascii="Times New Roman" w:hAnsi="Times New Roman" w:cs="Times New Roman"/>
+          <w:sz w:val="28"/>
+          <w:szCs w:val="28"/>
+        </w:rPr>
+      </w:pPr>
+      <w:r>
+        <w:rPr>
+          <w:rFonts w:ascii="Times New Roman" w:hAnsi="Times New Roman" w:cs="Times New Roman"/>
+          <w:sz w:val="28"/>
+          <w:szCs w:val="28"/>
+        </w:rPr>
+        <w:t>running_shoe_wrong_category (23): query giày chạy bộ gán positive giày công nghiệp/sneaker.</w:t>
+      </w:r>
+    </w:p>
+    <w:p>
+      <w:pPr>
+        <w:pStyle w:val="ListBullet"/>
+        <w:rPr>
+          <w:rFonts w:ascii="Times New Roman" w:hAnsi="Times New Roman" w:cs="Times New Roman"/>
+          <w:sz w:val="28"/>
+          <w:szCs w:val="28"/>
+        </w:rPr>
+      </w:pPr>
+      <w:r>
+        <w:rPr>
+          <w:rFonts w:ascii="Times New Roman" w:hAnsi="Times New Roman" w:cs="Times New Roman"/>
+          <w:sz w:val="28"/>
+          <w:szCs w:val="28"/>
+        </w:rPr>
+        <w:t>generic_shoe_work_boot (5), headphone_query_truck_driver (4): pollution điển hình.</w:t>
+      </w:r>
+    </w:p>
+    <w:p>
+      <w:pPr>
+        <w:pStyle w:val="ListBullet"/>
+        <w:rPr>
+          <w:rFonts w:ascii="Times New Roman" w:hAnsi="Times New Roman" w:cs="Times New Roman"/>
+          <w:sz w:val="28"/>
+          <w:szCs w:val="28"/>
+        </w:rPr>
+      </w:pPr>
+      <w:r>
+        <w:rPr>
+          <w:rFonts w:ascii="Times New Roman" w:hAnsi="Times New Roman" w:cs="Times New Roman"/>
+          <w:sz w:val="28"/>
+          <w:szCs w:val="28"/>
+        </w:rPr>
+        <w:t>Log chi tiết: embedding_project/data/train_removed_pairs_v2.jsonl</w:t>
+      </w:r>
+    </w:p>
+    <w:p>
+      <w:pPr>
+        <w:pStyle w:val="Heading2"/>
+        <w:rPr>
+          <w:rFonts w:ascii="Times New Roman" w:hAnsi="Times New Roman" w:cs="Times New Roman"/>
+          <w:color w:val="auto"/>
+          <w:sz w:val="28"/>
+          <w:szCs w:val="28"/>
+        </w:rPr>
+      </w:pPr>
+      <w:r>
+        <w:rPr>
+          <w:rFonts w:ascii="Times New Roman" w:hAnsi="Times New Roman" w:cs="Times New Roman"/>
+          <w:color w:val="auto"/>
+          <w:sz w:val="28"/>
+          <w:szCs w:val="28"/>
+        </w:rPr>
+        <w:t>7.2. Mine hard negative theo category (v2)</w:t>
+      </w:r>
+    </w:p>
+    <w:p>
+      <w:pPr>
+        <w:rPr>
+          <w:rFonts w:ascii="Times New Roman" w:hAnsi="Times New Roman" w:cs="Times New Roman"/>
+          <w:sz w:val="28"/>
+          <w:szCs w:val="28"/>
+        </w:rPr>
+      </w:pPr>
+      <w:r>
+        <w:rPr>
+          <w:rFonts w:ascii="Times New Roman" w:hAnsi="Times New Roman" w:cs="Times New Roman"/>
+          <w:sz w:val="28"/>
+          <w:szCs w:val="28"/>
+        </w:rPr>
+        <w:t>Script: embedding_project/scripts/mine_category_hard_negatives_from_qdrant.py. Mine từ Qdrant bằng vector search, xuất triplets JSONL cho TripletLoss.</w:t>
+      </w:r>
+    </w:p>
+    <w:p>
+      <w:pPr>
+        <w:rPr>
+          <w:rFonts w:ascii="Times New Roman" w:hAnsi="Times New Roman" w:cs="Times New Roman"/>
+          <w:sz w:val="28"/>
+          <w:szCs w:val="28"/>
+        </w:rPr>
+      </w:pPr>
+      <w:r>
+        <w:rPr>
+          <w:rFonts w:ascii="Times New Roman" w:hAnsi="Times New Roman" w:cs="Times New Roman"/>
+          <w:sz w:val="28"/>
+          <w:szCs w:val="28"/>
+        </w:rPr>
+        <w:t>Pipeline mine v2 — điều kiện negative (tất cả phải thỏa):</w:t>
+      </w:r>
+    </w:p>
+    <w:p>
+      <w:pPr>
+        <w:pStyle w:val="ListBullet"/>
+        <w:rPr>
+          <w:rFonts w:ascii="Times New Roman" w:hAnsi="Times New Roman" w:cs="Times New Roman"/>
+          <w:sz w:val="28"/>
+          <w:szCs w:val="28"/>
+        </w:rPr>
+      </w:pPr>
+      <w:r>
+        <w:rPr>
+          <w:rFonts w:ascii="Times New Roman" w:hAnsi="Times New Roman" w:cs="Times New Roman"/>
+          <w:sz w:val="28"/>
+          <w:szCs w:val="28"/>
+        </w:rPr>
+        <w:t>product_id ≠ positive; category leaf khác sau normalize (loại sneaker↔sneaker chỉ khác nam/nữ).</w:t>
+      </w:r>
+    </w:p>
+    <w:p>
+      <w:pPr>
+        <w:pStyle w:val="ListBullet"/>
+        <w:rPr>
+          <w:rFonts w:ascii="Times New Roman" w:hAnsi="Times New Roman" w:cs="Times New Roman"/>
+          <w:sz w:val="28"/>
+          <w:szCs w:val="28"/>
+        </w:rPr>
+      </w:pPr>
+      <w:r>
+        <w:rPr>
+          <w:rFonts w:ascii="Times New Roman" w:hAnsi="Times New Roman" w:cs="Times New Roman"/>
+          <w:sz w:val="28"/>
+          <w:szCs w:val="28"/>
+        </w:rPr>
+        <w:lastRenderedPageBreak/>
+        <w:t>Không cùng intent cụ thể với query (tai nghe, chạy bộ, sneaker, máy sấy tóc, …).</w:t>
+      </w:r>
+    </w:p>
+    <w:p>
+      <w:pPr>
+        <w:pStyle w:val="ListBullet"/>
+        <w:rPr>
+          <w:rFonts w:ascii="Times New Roman" w:hAnsi="Times New Roman" w:cs="Times New Roman"/>
+          <w:sz w:val="28"/>
+          <w:szCs w:val="28"/>
+        </w:rPr>
+      </w:pPr>
+      <w:r>
+        <w:rPr>
+          <w:rFonts w:ascii="Times New Roman" w:hAnsi="Times New Roman" w:cs="Times New Roman"/>
+          <w:sz w:val="28"/>
+          <w:szCs w:val="28"/>
+        </w:rPr>
+        <w:t>Không cùng subtype giày sai (chạy bộ vs sneaker thể thao); giữ giày công nghiệp/mũi thép.</w:t>
+      </w:r>
+    </w:p>
+    <w:p>
+      <w:pPr>
+        <w:pStyle w:val="ListBullet"/>
+        <w:rPr>
+          <w:rFonts w:ascii="Times New Roman" w:hAnsi="Times New Roman" w:cs="Times New Roman"/>
+          <w:sz w:val="28"/>
+          <w:szCs w:val="28"/>
+        </w:rPr>
+      </w:pPr>
+      <w:r>
+        <w:rPr>
+          <w:rFonts w:ascii="Times New Roman" w:hAnsi="Times New Roman" w:cs="Times New Roman"/>
+          <w:sz w:val="28"/>
+          <w:szCs w:val="28"/>
+        </w:rPr>
+        <w:t>Loại cặp nhầm: tai nghe ↔ bông tai; giày trượt ↔ sneaker.</w:t>
+      </w:r>
+    </w:p>
+    <w:p>
+      <w:pPr>
+        <w:pStyle w:val="ListBullet"/>
+        <w:rPr>
+          <w:rFonts w:ascii="Times New Roman" w:hAnsi="Times New Roman" w:cs="Times New Roman"/>
+          <w:sz w:val="28"/>
+          <w:szCs w:val="28"/>
+        </w:rPr>
+      </w:pPr>
+      <w:r>
+        <w:rPr>
+          <w:rFonts w:ascii="Times New Roman" w:hAnsi="Times New Roman" w:cs="Times New Roman"/>
+          <w:sz w:val="28"/>
+          <w:szCs w:val="28"/>
+        </w:rPr>
+        <w:t>Score cosine trong band [0.48, 0.84] — không quá dễ, không quá giống (false negative).</w:t>
+      </w:r>
+    </w:p>
+    <w:p>
+      <w:pPr>
+        <w:pStyle w:val="ListBullet"/>
+        <w:rPr>
+          <w:rFonts w:ascii="Times New Roman" w:hAnsi="Times New Roman" w:cs="Times New Roman"/>
+          <w:sz w:val="28"/>
+          <w:szCs w:val="28"/>
+        </w:rPr>
+      </w:pPr>
+      <w:r>
+        <w:rPr>
+          <w:rFonts w:ascii="Times New Roman" w:hAnsi="Times New Roman" w:cs="Times New Roman"/>
+          <w:sz w:val="28"/>
+          <w:szCs w:val="28"/>
+        </w:rPr>
+        <w:t>Bỏ top-1 search (min_rank=2); mỗi negative_product_id tái sử dụng tối đa 5 lần.</w:t>
+      </w:r>
+    </w:p>
+    <w:p>
+      <w:pPr>
+        <w:rPr>
+          <w:rFonts w:ascii="Times New Roman" w:hAnsi="Times New Roman" w:cs="Times New Roman"/>
+          <w:sz w:val="28"/>
+          <w:szCs w:val="28"/>
+        </w:rPr>
+      </w:pPr>
+      <w:r>
+        <w:rPr>
+          <w:rFonts w:ascii="Times New Roman" w:hAnsi="Times New Roman" w:cs="Times New Roman"/>
+          <w:sz w:val="28"/>
+          <w:szCs w:val="28"/>
+        </w:rPr>
+        <w:t>Kết quả mine full (2.000 anchor, neg_per_anchor=1): 180 triplets / 1.820 anchor không tìm được negative hợp lệ. File: embedding_project/data/train_triplets_category_hardneg_v2.jsonl. Ưu tiên chất lượng hơn số lượng — tỷ lệ thu được ~9% anchor.</w:t>
+      </w:r>
+    </w:p>
+    <w:p>
+      <w:pPr>
+        <w:pStyle w:val="Heading2"/>
+        <w:rPr>
+          <w:rFonts w:ascii="Times New Roman" w:hAnsi="Times New Roman" w:cs="Times New Roman"/>
+          <w:color w:val="auto"/>
+          <w:sz w:val="28"/>
+          <w:szCs w:val="28"/>
+        </w:rPr>
+      </w:pPr>
+      <w:r>
+        <w:rPr>
+          <w:rFonts w:ascii="Times New Roman" w:hAnsi="Times New Roman" w:cs="Times New Roman"/>
+          <w:color w:val="auto"/>
+          <w:sz w:val="28"/>
+          <w:szCs w:val="28"/>
+        </w:rPr>
+        <w:t>7.3. Huấn luyện TripletLoss (từ model 1 epoch)</w:t>
+      </w:r>
+    </w:p>
+    <w:p>
+      <w:pPr>
+        <w:rPr>
+          <w:rFonts w:ascii="Times New Roman" w:hAnsi="Times New Roman" w:cs="Times New Roman"/>
+          <w:sz w:val="28"/>
+          <w:szCs w:val="28"/>
+        </w:rPr>
+      </w:pPr>
+      <w:r>
+        <w:rPr>
+          <w:rFonts w:ascii="Times New Roman" w:hAnsi="Times New Roman" w:cs="Times New Roman"/>
+          <w:sz w:val="28"/>
+          <w:szCs w:val="28"/>
+        </w:rPr>
+        <w:t>Script: embedding_project/scripts/train_e5_base_triplet_loss_from_jsonl.py. Notebook Colab: embedding_project/notebooks/train_e5_triplet_hardneg_colab.ipynb.</w:t>
+      </w:r>
+    </w:p>
+    <w:tbl>
+      <w:tblPr>
+        <w:tblStyle w:val="TableGrid"/>
+        <w:tblW w:w="0" w:type="auto"/>
+        <w:tblLook w:val="04A0" w:firstRow="1" w:lastRow="0" w:firstColumn="1" w:lastColumn="0" w:noHBand="0" w:noVBand="1"/>
+      </w:tblPr>
+      <w:tblGrid>
+        <w:gridCol w:w="3842"/>
+        <w:gridCol w:w="5014"/>
+      </w:tblGrid>
+      <w:tr>
+        <w:tc>
+          <w:tcPr>
+            <w:tcW w:w="4320" w:type="dxa"/>
+          </w:tcPr>
+          <w:p>
+            <w:pPr>
+              <w:rPr>
+                <w:rFonts w:ascii="Times New Roman" w:hAnsi="Times New Roman" w:cs="Times New Roman"/>
+                <w:sz w:val="28"/>
+                <w:szCs w:val="28"/>
+              </w:rPr>
+            </w:pPr>
+            <w:r>
+              <w:rPr>
+                <w:rFonts w:ascii="Times New Roman" w:hAnsi="Times New Roman" w:cs="Times New Roman"/>
+                <w:sz w:val="28"/>
+                <w:szCs w:val="28"/>
+              </w:rPr>
+              <w:t>Tham số</w:t>
+            </w:r>
+          </w:p>
+        </w:tc>
+        <w:tc>
+          <w:tcPr>
+            <w:tcW w:w="4320" w:type="dxa"/>
+          </w:tcPr>
+          <w:p>
+            <w:pPr>
+              <w:rPr>
+                <w:rFonts w:ascii="Times New Roman" w:hAnsi="Times New Roman" w:cs="Times New Roman"/>
+                <w:sz w:val="28"/>
+                <w:szCs w:val="28"/>
+              </w:rPr>
+            </w:pPr>
+            <w:r>
+              <w:rPr>
+                <w:rFonts w:ascii="Times New Roman" w:hAnsi="Times New Roman" w:cs="Times New Roman"/>
+                <w:sz w:val="28"/>
+                <w:szCs w:val="28"/>
+              </w:rPr>
+              <w:t>Giá trị</w:t>
+            </w:r>
+          </w:p>
+        </w:tc>
+      </w:tr>
+      <w:tr>
+        <w:tc>
+          <w:tcPr>
+            <w:tcW w:w="4320" w:type="dxa"/>
+          </w:tcPr>
+          <w:p>
+            <w:pPr>
+              <w:rPr>
+                <w:rFonts w:ascii="Times New Roman" w:hAnsi="Times New Roman" w:cs="Times New Roman"/>
+                <w:sz w:val="28"/>
+                <w:szCs w:val="28"/>
+              </w:rPr>
+            </w:pPr>
+            <w:r>
+              <w:rPr>
+                <w:rFonts w:ascii="Times New Roman" w:hAnsi="Times New Roman" w:cs="Times New Roman"/>
+                <w:sz w:val="28"/>
+                <w:szCs w:val="28"/>
+              </w:rPr>
+              <w:t>Base model</w:t>
+            </w:r>
+          </w:p>
+        </w:tc>
+        <w:tc>
+          <w:tcPr>
+            <w:tcW w:w="4320" w:type="dxa"/>
+          </w:tcPr>
+          <w:p>
+            <w:pPr>
+              <w:rPr>
+                <w:rFonts w:ascii="Times New Roman" w:hAnsi="Times New Roman" w:cs="Times New Roman"/>
+                <w:sz w:val="28"/>
+                <w:szCs w:val="28"/>
+              </w:rPr>
+            </w:pPr>
+            <w:r>
+              <w:rPr>
+                <w:rFonts w:ascii="Times New Roman" w:hAnsi="Times New Roman" w:cs="Times New Roman"/>
+                <w:sz w:val="28"/>
+                <w:szCs w:val="28"/>
+              </w:rPr>
+              <w:t>e5_base_finetuned_final (1 epoch, không train lại từ pretrained)</w:t>
+            </w:r>
+          </w:p>
+        </w:tc>
+      </w:tr>
+      <w:tr>
+        <w:tc>
+          <w:tcPr>
+            <w:tcW w:w="4320" w:type="dxa"/>
+          </w:tcPr>
+          <w:p>
+            <w:pPr>
+              <w:rPr>
+                <w:rFonts w:ascii="Times New Roman" w:hAnsi="Times New Roman" w:cs="Times New Roman"/>
+                <w:sz w:val="28"/>
+                <w:szCs w:val="28"/>
+              </w:rPr>
+            </w:pPr>
+            <w:r>
+              <w:rPr>
+                <w:rFonts w:ascii="Times New Roman" w:hAnsi="Times New Roman" w:cs="Times New Roman"/>
+                <w:sz w:val="28"/>
+                <w:szCs w:val="28"/>
+              </w:rPr>
+              <w:t>Loss</w:t>
+            </w:r>
+          </w:p>
+        </w:tc>
+        <w:tc>
+          <w:tcPr>
+            <w:tcW w:w="4320" w:type="dxa"/>
+          </w:tcPr>
+          <w:p>
+            <w:pPr>
+              <w:rPr>
+                <w:rFonts w:ascii="Times New Roman" w:hAnsi="Times New Roman" w:cs="Times New Roman"/>
+                <w:sz w:val="28"/>
+                <w:szCs w:val="28"/>
+              </w:rPr>
+            </w:pPr>
+            <w:r>
+              <w:rPr>
+                <w:rFonts w:ascii="Times New Roman" w:hAnsi="Times New Roman" w:cs="Times New Roman"/>
+                <w:sz w:val="28"/>
+                <w:szCs w:val="28"/>
+              </w:rPr>
+              <w:t>TripletLoss, triplet_margin=0.2</w:t>
+            </w:r>
+          </w:p>
+        </w:tc>
+      </w:tr>
+      <w:tr>
+        <w:tc>
+          <w:tcPr>
+            <w:tcW w:w="4320" w:type="dxa"/>
+          </w:tcPr>
+          <w:p>
+            <w:pPr>
+              <w:rPr>
+                <w:rFonts w:ascii="Times New Roman" w:hAnsi="Times New Roman" w:cs="Times New Roman"/>
+                <w:sz w:val="28"/>
+                <w:szCs w:val="28"/>
+              </w:rPr>
+            </w:pPr>
+            <w:r>
+              <w:rPr>
+                <w:rFonts w:ascii="Times New Roman" w:hAnsi="Times New Roman" w:cs="Times New Roman"/>
+                <w:sz w:val="28"/>
+                <w:szCs w:val="28"/>
+              </w:rPr>
+              <w:t>Triplets</w:t>
+            </w:r>
+          </w:p>
+        </w:tc>
+        <w:tc>
+          <w:tcPr>
+            <w:tcW w:w="4320" w:type="dxa"/>
+          </w:tcPr>
+          <w:p>
+            <w:pPr>
+              <w:rPr>
+                <w:rFonts w:ascii="Times New Roman" w:hAnsi="Times New Roman" w:cs="Times New Roman"/>
+                <w:sz w:val="28"/>
+                <w:szCs w:val="28"/>
+              </w:rPr>
+            </w:pPr>
+            <w:r>
+              <w:rPr>
+                <w:rFonts w:ascii="Times New Roman" w:hAnsi="Times New Roman" w:cs="Times New Roman"/>
+                <w:sz w:val="28"/>
+                <w:szCs w:val="28"/>
+              </w:rPr>
+              <w:t>180 (train_triplets_category_hardneg_v2.jsonl)</w:t>
+            </w:r>
+          </w:p>
+        </w:tc>
+      </w:tr>
+      <w:tr>
+        <w:tc>
+          <w:tcPr>
+            <w:tcW w:w="4320" w:type="dxa"/>
+          </w:tcPr>
+          <w:p>
+            <w:pPr>
+              <w:rPr>
+                <w:rFonts w:ascii="Times New Roman" w:hAnsi="Times New Roman" w:cs="Times New Roman"/>
+                <w:sz w:val="28"/>
+                <w:szCs w:val="28"/>
+              </w:rPr>
+            </w:pPr>
+            <w:r>
+              <w:rPr>
+                <w:rFonts w:ascii="Times New Roman" w:hAnsi="Times New Roman" w:cs="Times New Roman"/>
+                <w:sz w:val="28"/>
+                <w:szCs w:val="28"/>
+              </w:rPr>
+              <w:t>Epochs / batch / lr</w:t>
+            </w:r>
+          </w:p>
+        </w:tc>
+        <w:tc>
+          <w:tcPr>
+            <w:tcW w:w="4320" w:type="dxa"/>
+          </w:tcPr>
+          <w:p>
+            <w:pPr>
+              <w:rPr>
+                <w:rFonts w:ascii="Times New Roman" w:hAnsi="Times New Roman" w:cs="Times New Roman"/>
+                <w:sz w:val="28"/>
+                <w:szCs w:val="28"/>
+              </w:rPr>
+            </w:pPr>
+            <w:r>
+              <w:rPr>
+                <w:rFonts w:ascii="Times New Roman" w:hAnsi="Times New Roman" w:cs="Times New Roman"/>
+                <w:sz w:val="28"/>
+                <w:szCs w:val="28"/>
+              </w:rPr>
+              <w:t>1 / 16 / 1e-5</w:t>
+            </w:r>
+          </w:p>
+        </w:tc>
+      </w:tr>
+      <w:tr>
+        <w:tc>
+          <w:tcPr>
+            <w:tcW w:w="4320" w:type="dxa"/>
+          </w:tcPr>
+          <w:p>
+            <w:pPr>
+              <w:rPr>
+                <w:rFonts w:ascii="Times New Roman" w:hAnsi="Times New Roman" w:cs="Times New Roman"/>
+                <w:sz w:val="28"/>
+                <w:szCs w:val="28"/>
+              </w:rPr>
+            </w:pPr>
+            <w:r>
+              <w:rPr>
+                <w:rFonts w:ascii="Times New Roman" w:hAnsi="Times New Roman" w:cs="Times New Roman"/>
+                <w:sz w:val="28"/>
+                <w:szCs w:val="28"/>
+              </w:rPr>
+              <w:t>Output</w:t>
+            </w:r>
+          </w:p>
+        </w:tc>
+        <w:tc>
+          <w:tcPr>
+            <w:tcW w:w="4320" w:type="dxa"/>
+          </w:tcPr>
+          <w:p>
+            <w:pPr>
+              <w:rPr>
+                <w:rFonts w:ascii="Times New Roman" w:hAnsi="Times New Roman" w:cs="Times New Roman"/>
+                <w:sz w:val="28"/>
+                <w:szCs w:val="28"/>
+              </w:rPr>
+            </w:pPr>
+            <w:r>
+              <w:rPr>
+                <w:rFonts w:ascii="Times New Roman" w:hAnsi="Times New Roman" w:cs="Times New Roman"/>
+                <w:sz w:val="28"/>
+                <w:szCs w:val="28"/>
+              </w:rPr>
+              <w:t>e5_base_triplet_hardneg_20260608_0827/</w:t>
+            </w:r>
+          </w:p>
+        </w:tc>
+      </w:tr>
+    </w:tbl>
+    <w:p>
+      <w:pPr>
+        <w:rPr>
+          <w:rFonts w:ascii="Times New Roman" w:hAnsi="Times New Roman" w:cs="Times New Roman"/>
+          <w:sz w:val="28"/>
+          <w:szCs w:val="28"/>
+        </w:rPr>
+      </w:pPr>
+      <w:r>
+        <w:rPr>
+          <w:rFonts w:ascii="Times New Roman" w:hAnsi="Times New Roman" w:cs="Times New Roman"/>
+          <w:sz w:val="28"/>
+          <w:szCs w:val="28"/>
+        </w:rPr>
+        <w:t>Lý do train từ 1 epoch: đã học domain tiếng Việt nhưng ít overfit hơn 2 epoch; TripletLoss bổ sung tín hiệu đẩy hard negative xuống mà không phá representation cơ bản.</w:t>
+      </w:r>
+    </w:p>
+    <w:p>
+      <w:pPr>
+        <w:rPr>
+          <w:rFonts w:ascii="Times New Roman" w:hAnsi="Times New Roman" w:cs="Times New Roman"/>
+          <w:sz w:val="28"/>
+          <w:szCs w:val="28"/>
+        </w:rPr>
+      </w:pPr>
+      <w:r>
+        <w:rPr>
+          <w:rFonts w:ascii="Times New Roman" w:hAnsi="Times New Roman" w:cs="Times New Roman"/>
+          <w:sz w:val="28"/>
+          <w:szCs w:val="28"/>
+        </w:rPr>
+        <w:t>Smoke test sau train (1 triplet): query 'thảm sàn an toàn' — cos(query, positive)=0.73, cos(query, negative)=0.42 → positive gần hơn negative.</w:t>
+      </w:r>
+    </w:p>
+    <w:p>
+      <w:pPr>
+        <w:pStyle w:val="Heading2"/>
+        <w:rPr>
+          <w:rFonts w:ascii="Times New Roman" w:hAnsi="Times New Roman" w:cs="Times New Roman"/>
+          <w:color w:val="auto"/>
+          <w:sz w:val="28"/>
+          <w:szCs w:val="28"/>
+        </w:rPr>
+      </w:pPr>
+      <w:r>
+        <w:rPr>
+          <w:rFonts w:ascii="Times New Roman" w:hAnsi="Times New Roman" w:cs="Times New Roman"/>
+          <w:color w:val="auto"/>
+          <w:sz w:val="28"/>
+          <w:szCs w:val="28"/>
+        </w:rPr>
+        <w:t>7.4. Index Qdrant collection mới</w:t>
+      </w:r>
+    </w:p>
+    <w:p>
+      <w:pPr>
+        <w:pStyle w:val="ListBullet"/>
+        <w:rPr>
+          <w:rFonts w:ascii="Times New Roman" w:hAnsi="Times New Roman" w:cs="Times New Roman"/>
+          <w:sz w:val="28"/>
+          <w:szCs w:val="28"/>
+        </w:rPr>
+      </w:pPr>
+      <w:r>
+        <w:rPr>
+          <w:rFonts w:ascii="Times New Roman" w:hAnsi="Times New Roman" w:cs="Times New Roman"/>
+          <w:sz w:val="28"/>
+          <w:szCs w:val="28"/>
+        </w:rPr>
+        <w:t>Collection: products_vi_e5_triplet (2.000 vector, dim 768).</w:t>
+      </w:r>
+    </w:p>
+    <w:p>
+      <w:pPr>
+        <w:pStyle w:val="ListBullet"/>
+        <w:rPr>
+          <w:rFonts w:ascii="Times New Roman" w:hAnsi="Times New Roman" w:cs="Times New Roman"/>
+          <w:sz w:val="28"/>
+          <w:szCs w:val="28"/>
+        </w:rPr>
+      </w:pPr>
+      <w:r>
+        <w:rPr>
+          <w:rFonts w:ascii="Times New Roman" w:hAnsi="Times New Roman" w:cs="Times New Roman"/>
+          <w:sz w:val="28"/>
+          <w:szCs w:val="28"/>
+        </w:rPr>
+        <w:lastRenderedPageBreak/>
+        <w:t>Model encode: e5_base_triplet_hardneg_20260608_0827, prefix query:/passage:.</w:t>
+      </w:r>
+    </w:p>
+    <w:p>
+      <w:pPr>
+        <w:pStyle w:val="ListBullet"/>
+        <w:rPr>
+          <w:rFonts w:ascii="Times New Roman" w:hAnsi="Times New Roman" w:cs="Times New Roman"/>
+          <w:sz w:val="28"/>
+          <w:szCs w:val="28"/>
+        </w:rPr>
+      </w:pPr>
+      <w:r>
+        <w:rPr>
+          <w:rFonts w:ascii="Times New Roman" w:hAnsi="Times New Roman" w:cs="Times New Roman"/>
+          <w:sz w:val="28"/>
+          <w:szCs w:val="28"/>
+        </w:rPr>
+        <w:t>Lệnh: python vector_db/03_index_to_qdrant.py --recreate --collection products_vi_e5_triplet --model-path ... --e5-prefix</w:t>
+      </w:r>
+    </w:p>
+    <w:p>
+      <w:pPr>
+        <w:pStyle w:val="ListBullet"/>
+        <w:rPr>
+          <w:rFonts w:ascii="Times New Roman" w:hAnsi="Times New Roman" w:cs="Times New Roman"/>
+          <w:sz w:val="28"/>
+          <w:szCs w:val="28"/>
+        </w:rPr>
+      </w:pPr>
+      <w:r>
+        <w:rPr>
+          <w:rFonts w:ascii="Times New Roman" w:hAnsi="Times New Roman" w:cs="Times New Roman"/>
+          <w:sz w:val="28"/>
+          <w:szCs w:val="28"/>
+        </w:rPr>
+        <w:t>Cùng server Qdrant với products_vi_e5_2ep; phục vụ A/B search thực tế.</w:t>
+      </w:r>
+    </w:p>
+    <w:p>
+      <w:pPr>
+        <w:pStyle w:val="Heading2"/>
+        <w:rPr>
+          <w:rFonts w:ascii="Times New Roman" w:hAnsi="Times New Roman" w:cs="Times New Roman"/>
+          <w:color w:val="auto"/>
+          <w:sz w:val="28"/>
+          <w:szCs w:val="28"/>
+        </w:rPr>
+      </w:pPr>
+      <w:r>
+        <w:rPr>
+          <w:rFonts w:ascii="Times New Roman" w:hAnsi="Times New Roman" w:cs="Times New Roman"/>
+          <w:color w:val="auto"/>
+          <w:sz w:val="28"/>
+          <w:szCs w:val="28"/>
+        </w:rPr>
+        <w:t>7.5. Đánh giá sơ bộ model Triplet (query dễ nhầm category)</w:t>
+      </w:r>
+    </w:p>
+    <w:p>
+      <w:pPr>
+        <w:rPr>
+          <w:rFonts w:ascii="Times New Roman" w:hAnsi="Times New Roman" w:cs="Times New Roman"/>
+          <w:sz w:val="28"/>
+          <w:szCs w:val="28"/>
+        </w:rPr>
+      </w:pPr>
+      <w:r>
+        <w:rPr>
+          <w:rFonts w:ascii="Times New Roman" w:hAnsi="Times New Roman" w:cs="Times New Roman"/>
+          <w:sz w:val="28"/>
+          <w:szCs w:val="28"/>
+        </w:rPr>
+        <w:t>Test top-5 trên corpus 2.000 SP (không qua Qdrant), 10 query hay lỗi. File: embedding_project/outputs/evaluation/triplet_confusing_queries_top5.csv</w:t>
+      </w:r>
+    </w:p>
+    <w:tbl>
+      <w:tblPr>
+        <w:tblStyle w:val="TableGrid"/>
+        <w:tblW w:w="0" w:type="auto"/>
+        <w:tblLook w:val="04A0" w:firstRow="1" w:lastRow="0" w:firstColumn="1" w:lastColumn="0" w:noHBand="0" w:noVBand="1"/>
+      </w:tblPr>
+      <w:tblGrid>
+        <w:gridCol w:w="2880"/>
+        <w:gridCol w:w="2880"/>
+        <w:gridCol w:w="2880"/>
+      </w:tblGrid>
+      <w:tr>
+        <w:tc>
+          <w:tcPr>
+            <w:tcW w:w="2880" w:type="dxa"/>
+          </w:tcPr>
+          <w:p>
+            <w:pPr>
+              <w:rPr>
+                <w:rFonts w:ascii="Times New Roman" w:hAnsi="Times New Roman" w:cs="Times New Roman"/>
+                <w:sz w:val="28"/>
+                <w:szCs w:val="28"/>
+              </w:rPr>
+            </w:pPr>
+            <w:r>
+              <w:rPr>
+                <w:rFonts w:ascii="Times New Roman" w:hAnsi="Times New Roman" w:cs="Times New Roman"/>
+                <w:sz w:val="28"/>
+                <w:szCs w:val="28"/>
+              </w:rPr>
+              <w:t>Query</w:t>
+            </w:r>
+          </w:p>
+        </w:tc>
+        <w:tc>
+          <w:tcPr>
+            <w:tcW w:w="2880" w:type="dxa"/>
+          </w:tcPr>
+          <w:p>
+            <w:pPr>
+              <w:rPr>
+                <w:rFonts w:ascii="Times New Roman" w:hAnsi="Times New Roman" w:cs="Times New Roman"/>
+                <w:sz w:val="28"/>
+                <w:szCs w:val="28"/>
+              </w:rPr>
+            </w:pPr>
+            <w:r>
+              <w:rPr>
+                <w:rFonts w:ascii="Times New Roman" w:hAnsi="Times New Roman" w:cs="Times New Roman"/>
+                <w:sz w:val="28"/>
+                <w:szCs w:val="28"/>
+              </w:rPr>
+              <w:t>Top-1 Triplet</w:t>
+            </w:r>
+          </w:p>
+        </w:tc>
+        <w:tc>
+          <w:tcPr>
+            <w:tcW w:w="2880" w:type="dxa"/>
+          </w:tcPr>
+          <w:p>
+            <w:pPr>
+              <w:rPr>
+                <w:rFonts w:ascii="Times New Roman" w:hAnsi="Times New Roman" w:cs="Times New Roman"/>
+                <w:sz w:val="28"/>
+                <w:szCs w:val="28"/>
+              </w:rPr>
+            </w:pPr>
+            <w:r>
+              <w:rPr>
+                <w:rFonts w:ascii="Times New Roman" w:hAnsi="Times New Roman" w:cs="Times New Roman"/>
+                <w:sz w:val="28"/>
+                <w:szCs w:val="28"/>
+              </w:rPr>
+              <w:t>Đánh giá</w:t>
+            </w:r>
+          </w:p>
+        </w:tc>
+      </w:tr>
+      <w:tr>
+        <w:tc>
+          <w:tcPr>
+            <w:tcW w:w="2880" w:type="dxa"/>
+          </w:tcPr>
+          <w:p>
+            <w:pPr>
+              <w:rPr>
+                <w:rFonts w:ascii="Times New Roman" w:hAnsi="Times New Roman" w:cs="Times New Roman"/>
+                <w:sz w:val="28"/>
+                <w:szCs w:val="28"/>
+              </w:rPr>
+            </w:pPr>
+            <w:r>
+              <w:rPr>
+                <w:rFonts w:ascii="Times New Roman" w:hAnsi="Times New Roman" w:cs="Times New Roman"/>
+                <w:sz w:val="28"/>
+                <w:szCs w:val="28"/>
+              </w:rPr>
+              <w:t>tai nghe không dây trắng</w:t>
+            </w:r>
+          </w:p>
+        </w:tc>
+        <w:tc>
+          <w:tcPr>
+            <w:tcW w:w="2880" w:type="dxa"/>
+          </w:tcPr>
+          <w:p>
+            <w:pPr>
+              <w:rPr>
+                <w:rFonts w:ascii="Times New Roman" w:hAnsi="Times New Roman" w:cs="Times New Roman"/>
+                <w:sz w:val="28"/>
+                <w:szCs w:val="28"/>
+              </w:rPr>
+            </w:pPr>
+            <w:r>
+              <w:rPr>
+                <w:rFonts w:ascii="Times New Roman" w:hAnsi="Times New Roman" w:cs="Times New Roman"/>
+                <w:sz w:val="28"/>
+                <w:szCs w:val="28"/>
+              </w:rPr>
+              <w:t>Disney J300 tai nghe không dây</w:t>
+            </w:r>
+          </w:p>
+        </w:tc>
+        <w:tc>
+          <w:tcPr>
+            <w:tcW w:w="2880" w:type="dxa"/>
+          </w:tcPr>
+          <w:p>
+            <w:pPr>
+              <w:rPr>
+                <w:rFonts w:ascii="Times New Roman" w:hAnsi="Times New Roman" w:cs="Times New Roman"/>
+                <w:sz w:val="28"/>
+                <w:szCs w:val="28"/>
+              </w:rPr>
+            </w:pPr>
+            <w:r>
+              <w:rPr>
+                <w:rFonts w:ascii="Times New Roman" w:hAnsi="Times New Roman" w:cs="Times New Roman"/>
+                <w:sz w:val="28"/>
+                <w:szCs w:val="28"/>
+              </w:rPr>
+              <w:t>Đúng loại</w:t>
+            </w:r>
+          </w:p>
+        </w:tc>
+      </w:tr>
+      <w:tr>
+        <w:tc>
+          <w:tcPr>
+            <w:tcW w:w="2880" w:type="dxa"/>
+          </w:tcPr>
+          <w:p>
+            <w:pPr>
+              <w:rPr>
+                <w:rFonts w:ascii="Times New Roman" w:hAnsi="Times New Roman" w:cs="Times New Roman"/>
+                <w:sz w:val="28"/>
+                <w:szCs w:val="28"/>
+              </w:rPr>
+            </w:pPr>
+            <w:r>
+              <w:rPr>
+                <w:rFonts w:ascii="Times New Roman" w:hAnsi="Times New Roman" w:cs="Times New Roman"/>
+                <w:sz w:val="28"/>
+                <w:szCs w:val="28"/>
+              </w:rPr>
+              <w:t>giày sneaker thời trang nhẹ</w:t>
+            </w:r>
+          </w:p>
+        </w:tc>
+        <w:tc>
+          <w:tcPr>
+            <w:tcW w:w="2880" w:type="dxa"/>
+          </w:tcPr>
+          <w:p>
+            <w:pPr>
+              <w:rPr>
+                <w:rFonts w:ascii="Times New Roman" w:hAnsi="Times New Roman" w:cs="Times New Roman"/>
+                <w:sz w:val="28"/>
+                <w:szCs w:val="28"/>
+              </w:rPr>
+            </w:pPr>
+            <w:r>
+              <w:rPr>
+                <w:rFonts w:ascii="Times New Roman" w:hAnsi="Times New Roman" w:cs="Times New Roman"/>
+                <w:sz w:val="28"/>
+                <w:szCs w:val="28"/>
+              </w:rPr>
+              <w:t>New Balance 574 sneaker nam</w:t>
+            </w:r>
+          </w:p>
+        </w:tc>
+        <w:tc>
+          <w:tcPr>
+            <w:tcW w:w="2880" w:type="dxa"/>
+          </w:tcPr>
+          <w:p>
+            <w:pPr>
+              <w:rPr>
+                <w:rFonts w:ascii="Times New Roman" w:hAnsi="Times New Roman" w:cs="Times New Roman"/>
+                <w:sz w:val="28"/>
+                <w:szCs w:val="28"/>
+              </w:rPr>
+            </w:pPr>
+            <w:r>
+              <w:rPr>
+                <w:rFonts w:ascii="Times New Roman" w:hAnsi="Times New Roman" w:cs="Times New Roman"/>
+                <w:sz w:val="28"/>
+                <w:szCs w:val="28"/>
+              </w:rPr>
+              <w:t>Đúng category</w:t>
+            </w:r>
+          </w:p>
+        </w:tc>
+      </w:tr>
+      <w:tr>
+        <w:tc>
+          <w:tcPr>
+            <w:tcW w:w="2880" w:type="dxa"/>
+          </w:tcPr>
+          <w:p>
+            <w:pPr>
+              <w:rPr>
+                <w:rFonts w:ascii="Times New Roman" w:hAnsi="Times New Roman" w:cs="Times New Roman"/>
+                <w:sz w:val="28"/>
+                <w:szCs w:val="28"/>
+              </w:rPr>
+            </w:pPr>
+            <w:r>
+              <w:rPr>
+                <w:rFonts w:ascii="Times New Roman" w:hAnsi="Times New Roman" w:cs="Times New Roman"/>
+                <w:sz w:val="28"/>
+                <w:szCs w:val="28"/>
+              </w:rPr>
+              <w:t>dầu dưỡng tóc giảm rụng</w:t>
+            </w:r>
+          </w:p>
+        </w:tc>
+        <w:tc>
+          <w:tcPr>
+            <w:tcW w:w="2880" w:type="dxa"/>
+          </w:tcPr>
+          <w:p>
+            <w:pPr>
+              <w:rPr>
+                <w:rFonts w:ascii="Times New Roman" w:hAnsi="Times New Roman" w:cs="Times New Roman"/>
+                <w:sz w:val="28"/>
+                <w:szCs w:val="28"/>
+              </w:rPr>
+            </w:pPr>
+            <w:r>
+              <w:rPr>
+                <w:rFonts w:ascii="Times New Roman" w:hAnsi="Times New Roman" w:cs="Times New Roman"/>
+                <w:sz w:val="28"/>
+                <w:szCs w:val="28"/>
+              </w:rPr>
+              <w:t>Dầu dưỡng tóc Adivasi</w:t>
+            </w:r>
+          </w:p>
+        </w:tc>
+        <w:tc>
+          <w:tcPr>
+            <w:tcW w:w="2880" w:type="dxa"/>
+          </w:tcPr>
+          <w:p>
+            <w:pPr>
+              <w:rPr>
+                <w:rFonts w:ascii="Times New Roman" w:hAnsi="Times New Roman" w:cs="Times New Roman"/>
+                <w:sz w:val="28"/>
+                <w:szCs w:val="28"/>
+              </w:rPr>
+            </w:pPr>
+            <w:r>
+              <w:rPr>
+                <w:rFonts w:ascii="Times New Roman" w:hAnsi="Times New Roman" w:cs="Times New Roman"/>
+                <w:sz w:val="28"/>
+                <w:szCs w:val="28"/>
+              </w:rPr>
+              <w:t>Đúng loại</w:t>
+            </w:r>
+          </w:p>
+        </w:tc>
+      </w:tr>
+      <w:tr>
+        <w:tc>
+          <w:tcPr>
+            <w:tcW w:w="2880" w:type="dxa"/>
+          </w:tcPr>
+          <w:p>
+            <w:pPr>
+              <w:rPr>
+                <w:rFonts w:ascii="Times New Roman" w:hAnsi="Times New Roman" w:cs="Times New Roman"/>
+                <w:sz w:val="28"/>
+                <w:szCs w:val="28"/>
+              </w:rPr>
+            </w:pPr>
+            <w:r>
+              <w:rPr>
+                <w:rFonts w:ascii="Times New Roman" w:hAnsi="Times New Roman" w:cs="Times New Roman"/>
+                <w:sz w:val="28"/>
+                <w:szCs w:val="28"/>
+              </w:rPr>
+              <w:t>ốp lưng điện thoại chống sốc</w:t>
+            </w:r>
+          </w:p>
+        </w:tc>
+        <w:tc>
+          <w:tcPr>
+            <w:tcW w:w="2880" w:type="dxa"/>
+          </w:tcPr>
+          <w:p>
+            <w:pPr>
+              <w:rPr>
+                <w:rFonts w:ascii="Times New Roman" w:hAnsi="Times New Roman" w:cs="Times New Roman"/>
+                <w:sz w:val="28"/>
+                <w:szCs w:val="28"/>
+              </w:rPr>
+            </w:pPr>
+            <w:r>
+              <w:rPr>
+                <w:rFonts w:ascii="Times New Roman" w:hAnsi="Times New Roman" w:cs="Times New Roman"/>
+                <w:sz w:val="28"/>
+                <w:szCs w:val="28"/>
+              </w:rPr>
+              <w:t>Ốp Samsung Galaxy</w:t>
+            </w:r>
+          </w:p>
+        </w:tc>
+        <w:tc>
+          <w:tcPr>
+            <w:tcW w:w="2880" w:type="dxa"/>
+          </w:tcPr>
+          <w:p>
+            <w:pPr>
+              <w:rPr>
+                <w:rFonts w:ascii="Times New Roman" w:hAnsi="Times New Roman" w:cs="Times New Roman"/>
+                <w:sz w:val="28"/>
+                <w:szCs w:val="28"/>
+              </w:rPr>
+            </w:pPr>
+            <w:r>
+              <w:rPr>
+                <w:rFonts w:ascii="Times New Roman" w:hAnsi="Times New Roman" w:cs="Times New Roman"/>
+                <w:sz w:val="28"/>
+                <w:szCs w:val="28"/>
+              </w:rPr>
+              <w:t>Đúng loại</w:t>
+            </w:r>
+          </w:p>
+        </w:tc>
+      </w:tr>
+      <w:tr>
+        <w:tc>
+          <w:tcPr>
+            <w:tcW w:w="2880" w:type="dxa"/>
+          </w:tcPr>
+          <w:p>
+            <w:pPr>
+              <w:rPr>
+                <w:rFonts w:ascii="Times New Roman" w:hAnsi="Times New Roman" w:cs="Times New Roman"/>
+                <w:sz w:val="28"/>
+                <w:szCs w:val="28"/>
+              </w:rPr>
+            </w:pPr>
+            <w:r>
+              <w:rPr>
+                <w:rFonts w:ascii="Times New Roman" w:hAnsi="Times New Roman" w:cs="Times New Roman"/>
+                <w:sz w:val="28"/>
+                <w:szCs w:val="28"/>
+              </w:rPr>
+              <w:t>giày chạy bộ nam nhẹ</w:t>
+            </w:r>
+          </w:p>
+        </w:tc>
+        <w:tc>
+          <w:tcPr>
+            <w:tcW w:w="2880" w:type="dxa"/>
+          </w:tcPr>
+          <w:p>
+            <w:pPr>
+              <w:rPr>
+                <w:rFonts w:ascii="Times New Roman" w:hAnsi="Times New Roman" w:cs="Times New Roman"/>
+                <w:sz w:val="28"/>
+                <w:szCs w:val="28"/>
+              </w:rPr>
+            </w:pPr>
+            <w:r>
+              <w:rPr>
+                <w:rFonts w:ascii="Times New Roman" w:hAnsi="Times New Roman" w:cs="Times New Roman"/>
+                <w:sz w:val="28"/>
+                <w:szCs w:val="28"/>
+              </w:rPr>
+              <w:t>Sperry sneaker thời trang</w:t>
+            </w:r>
+          </w:p>
+        </w:tc>
+        <w:tc>
+          <w:tcPr>
+            <w:tcW w:w="2880" w:type="dxa"/>
+          </w:tcPr>
+          <w:p>
+            <w:pPr>
+              <w:rPr>
+                <w:rFonts w:ascii="Times New Roman" w:hAnsi="Times New Roman" w:cs="Times New Roman"/>
+                <w:sz w:val="28"/>
+                <w:szCs w:val="28"/>
+              </w:rPr>
+            </w:pPr>
+            <w:r>
+              <w:rPr>
+                <w:rFonts w:ascii="Times New Roman" w:hAnsi="Times New Roman" w:cs="Times New Roman"/>
+                <w:sz w:val="28"/>
+                <w:szCs w:val="28"/>
+              </w:rPr>
+              <w:t>Sai intent (không phải chạy bộ)</w:t>
+            </w:r>
+          </w:p>
+        </w:tc>
+      </w:tr>
+      <w:tr>
+        <w:tc>
+          <w:tcPr>
+            <w:tcW w:w="2880" w:type="dxa"/>
+          </w:tcPr>
+          <w:p>
+            <w:pPr>
+              <w:rPr>
+                <w:rFonts w:ascii="Times New Roman" w:hAnsi="Times New Roman" w:cs="Times New Roman"/>
+                <w:sz w:val="28"/>
+                <w:szCs w:val="28"/>
+              </w:rPr>
+            </w:pPr>
+            <w:r>
+              <w:rPr>
+                <w:rFonts w:ascii="Times New Roman" w:hAnsi="Times New Roman" w:cs="Times New Roman"/>
+                <w:sz w:val="28"/>
+                <w:szCs w:val="28"/>
+              </w:rPr>
+              <w:t>giày nam</w:t>
+            </w:r>
+          </w:p>
+        </w:tc>
+        <w:tc>
+          <w:tcPr>
+            <w:tcW w:w="2880" w:type="dxa"/>
+          </w:tcPr>
+          <w:p>
+            <w:pPr>
+              <w:rPr>
+                <w:rFonts w:ascii="Times New Roman" w:hAnsi="Times New Roman" w:cs="Times New Roman"/>
+                <w:sz w:val="28"/>
+                <w:szCs w:val="28"/>
+              </w:rPr>
+            </w:pPr>
+            <w:r>
+              <w:rPr>
+                <w:rFonts w:ascii="Times New Roman" w:hAnsi="Times New Roman" w:cs="Times New Roman"/>
+                <w:sz w:val="28"/>
+                <w:szCs w:val="28"/>
+              </w:rPr>
+              <w:t>Wolverine giày ủng công nghiệp</w:t>
+            </w:r>
+          </w:p>
+        </w:tc>
+        <w:tc>
+          <w:tcPr>
+            <w:tcW w:w="2880" w:type="dxa"/>
+          </w:tcPr>
+          <w:p>
+            <w:pPr>
+              <w:rPr>
+                <w:rFonts w:ascii="Times New Roman" w:hAnsi="Times New Roman" w:cs="Times New Roman"/>
+                <w:sz w:val="28"/>
+                <w:szCs w:val="28"/>
+              </w:rPr>
+            </w:pPr>
+            <w:r>
+              <w:rPr>
+                <w:rFonts w:ascii="Times New Roman" w:hAnsi="Times New Roman" w:cs="Times New Roman"/>
+                <w:sz w:val="28"/>
+                <w:szCs w:val="28"/>
+              </w:rPr>
+              <w:t>Pollution còn (giày công nghiệp)</w:t>
+            </w:r>
+          </w:p>
+        </w:tc>
+      </w:tr>
+      <w:tr>
+        <w:tc>
+          <w:tcPr>
+            <w:tcW w:w="2880" w:type="dxa"/>
+          </w:tcPr>
+          <w:p>
+            <w:pPr>
+              <w:rPr>
+                <w:rFonts w:ascii="Times New Roman" w:hAnsi="Times New Roman" w:cs="Times New Roman"/>
+                <w:sz w:val="28"/>
+                <w:szCs w:val="28"/>
+              </w:rPr>
+            </w:pPr>
+            <w:r>
+              <w:rPr>
+                <w:rFonts w:ascii="Times New Roman" w:hAnsi="Times New Roman" w:cs="Times New Roman"/>
+                <w:sz w:val="28"/>
+                <w:szCs w:val="28"/>
+              </w:rPr>
+              <w:t>tai nghe bluetooth chống ồn</w:t>
+            </w:r>
+          </w:p>
+        </w:tc>
+        <w:tc>
+          <w:tcPr>
+            <w:tcW w:w="2880" w:type="dxa"/>
+          </w:tcPr>
+          <w:p>
+            <w:pPr>
+              <w:rPr>
+                <w:rFonts w:ascii="Times New Roman" w:hAnsi="Times New Roman" w:cs="Times New Roman"/>
+                <w:sz w:val="28"/>
+                <w:szCs w:val="28"/>
+              </w:rPr>
+            </w:pPr>
+            <w:r>
+              <w:rPr>
+                <w:rFonts w:ascii="Times New Roman" w:hAnsi="Times New Roman" w:cs="Times New Roman"/>
+                <w:sz w:val="28"/>
+                <w:szCs w:val="28"/>
+              </w:rPr>
+              <w:t>Tai nghe tài xế xe tải</w:t>
+            </w:r>
+          </w:p>
+        </w:tc>
+        <w:tc>
+          <w:tcPr>
+            <w:tcW w:w="2880" w:type="dxa"/>
+          </w:tcPr>
+          <w:p>
+            <w:pPr>
+              <w:rPr>
+                <w:rFonts w:ascii="Times New Roman" w:hAnsi="Times New Roman" w:cs="Times New Roman"/>
+                <w:sz w:val="28"/>
+                <w:szCs w:val="28"/>
+              </w:rPr>
+            </w:pPr>
+            <w:r>
+              <w:rPr>
+                <w:rFonts w:ascii="Times New Roman" w:hAnsi="Times New Roman" w:cs="Times New Roman"/>
+                <w:sz w:val="28"/>
+                <w:szCs w:val="28"/>
+              </w:rPr>
+              <w:t>Pollution còn</w:t>
+            </w:r>
+          </w:p>
+        </w:tc>
+      </w:tr>
+      <w:tr>
+        <w:tc>
+          <w:tcPr>
+            <w:tcW w:w="2880" w:type="dxa"/>
+          </w:tcPr>
+          <w:p>
+            <w:pPr>
+              <w:rPr>
+                <w:rFonts w:ascii="Times New Roman" w:hAnsi="Times New Roman" w:cs="Times New Roman"/>
+                <w:sz w:val="28"/>
+                <w:szCs w:val="28"/>
+              </w:rPr>
+            </w:pPr>
+            <w:r>
+              <w:rPr>
+                <w:rFonts w:ascii="Times New Roman" w:hAnsi="Times New Roman" w:cs="Times New Roman"/>
+                <w:sz w:val="28"/>
+                <w:szCs w:val="28"/>
+              </w:rPr>
+              <w:t>máy sấy tóc</w:t>
+            </w:r>
+          </w:p>
+        </w:tc>
+        <w:tc>
+          <w:tcPr>
+            <w:tcW w:w="2880" w:type="dxa"/>
+          </w:tcPr>
+          <w:p>
+            <w:pPr>
+              <w:rPr>
+                <w:rFonts w:ascii="Times New Roman" w:hAnsi="Times New Roman" w:cs="Times New Roman"/>
+                <w:sz w:val="28"/>
+                <w:szCs w:val="28"/>
+              </w:rPr>
+            </w:pPr>
+            <w:r>
+              <w:rPr>
+                <w:rFonts w:ascii="Times New Roman" w:hAnsi="Times New Roman" w:cs="Times New Roman"/>
+                <w:sz w:val="28"/>
+                <w:szCs w:val="28"/>
+              </w:rPr>
+              <w:t>Đèn sấy móng UV</w:t>
+            </w:r>
+          </w:p>
+        </w:tc>
+        <w:tc>
+          <w:tcPr>
+            <w:tcW w:w="2880" w:type="dxa"/>
+          </w:tcPr>
+          <w:p>
+            <w:pPr>
+              <w:rPr>
+                <w:rFonts w:ascii="Times New Roman" w:hAnsi="Times New Roman" w:cs="Times New Roman"/>
+                <w:sz w:val="28"/>
+                <w:szCs w:val="28"/>
+              </w:rPr>
+            </w:pPr>
+            <w:r>
+              <w:rPr>
+                <w:rFonts w:ascii="Times New Roman" w:hAnsi="Times New Roman" w:cs="Times New Roman"/>
+                <w:sz w:val="28"/>
+                <w:szCs w:val="28"/>
+              </w:rPr>
+              <w:t>Sai hoàn toàn</w:t>
+            </w:r>
+          </w:p>
+        </w:tc>
+      </w:tr>
+      <w:tr>
+        <w:tc>
+          <w:tcPr>
+            <w:tcW w:w="2880" w:type="dxa"/>
+          </w:tcPr>
+          <w:p>
+            <w:pPr>
+              <w:rPr>
+                <w:rFonts w:ascii="Times New Roman" w:hAnsi="Times New Roman" w:cs="Times New Roman"/>
+                <w:sz w:val="28"/>
+                <w:szCs w:val="28"/>
+              </w:rPr>
+            </w:pPr>
+            <w:r>
+              <w:rPr>
+                <w:rFonts w:ascii="Times New Roman" w:hAnsi="Times New Roman" w:cs="Times New Roman"/>
+                <w:sz w:val="28"/>
+                <w:szCs w:val="28"/>
+              </w:rPr>
+              <w:t>son môi màu hồng đất</w:t>
+            </w:r>
+          </w:p>
+        </w:tc>
+        <w:tc>
+          <w:tcPr>
+            <w:tcW w:w="2880" w:type="dxa"/>
+          </w:tcPr>
+          <w:p>
+            <w:pPr>
+              <w:rPr>
+                <w:rFonts w:ascii="Times New Roman" w:hAnsi="Times New Roman" w:cs="Times New Roman"/>
+                <w:sz w:val="28"/>
+                <w:szCs w:val="28"/>
+              </w:rPr>
+            </w:pPr>
+            <w:r>
+              <w:rPr>
+                <w:rFonts w:ascii="Times New Roman" w:hAnsi="Times New Roman" w:cs="Times New Roman"/>
+                <w:sz w:val="28"/>
+                <w:szCs w:val="28"/>
+              </w:rPr>
+              <w:t>Sơn móng tay</w:t>
+            </w:r>
+          </w:p>
+        </w:tc>
+        <w:tc>
+          <w:tcPr>
+            <w:tcW w:w="2880" w:type="dxa"/>
+          </w:tcPr>
+          <w:p>
+            <w:pPr>
+              <w:rPr>
+                <w:rFonts w:ascii="Times New Roman" w:hAnsi="Times New Roman" w:cs="Times New Roman"/>
+                <w:sz w:val="28"/>
+                <w:szCs w:val="28"/>
+              </w:rPr>
+            </w:pPr>
+            <w:r>
+              <w:rPr>
+                <w:rFonts w:ascii="Times New Roman" w:hAnsi="Times New Roman" w:cs="Times New Roman"/>
+                <w:sz w:val="28"/>
+                <w:szCs w:val="28"/>
+              </w:rPr>
+              <w:t>Nhầm son môi ↔ nail</w:t>
+            </w:r>
+          </w:p>
+        </w:tc>
+      </w:tr>
+    </w:tbl>
+    <w:p>
+      <w:pPr>
+        <w:rPr>
+          <w:rFonts w:ascii="Times New Roman" w:hAnsi="Times New Roman" w:cs="Times New Roman"/>
+          <w:sz w:val="28"/>
+          <w:szCs w:val="28"/>
+        </w:rPr>
+      </w:pPr>
+      <w:r>
+        <w:rPr>
+          <w:rFonts w:ascii="Times New Roman" w:hAnsi="Times New Roman" w:cs="Times New Roman"/>
+          <w:sz w:val="28"/>
+          <w:szCs w:val="28"/>
+        </w:rPr>
+        <w:t>Nhận xét giai đoạn 2:</w:t>
+      </w:r>
+    </w:p>
+    <w:p>
+      <w:pPr>
+        <w:pStyle w:val="ListBullet"/>
+        <w:rPr>
+          <w:rFonts w:ascii="Times New Roman" w:hAnsi="Times New Roman" w:cs="Times New Roman"/>
+          <w:sz w:val="28"/>
+          <w:szCs w:val="28"/>
+        </w:rPr>
+      </w:pPr>
+      <w:r>
+        <w:rPr>
+          <w:rFonts w:ascii="Times New Roman" w:hAnsi="Times New Roman" w:cs="Times New Roman"/>
+          <w:sz w:val="28"/>
+          <w:szCs w:val="28"/>
+        </w:rPr>
+        <w:t>Triplet cải thiện một số case rõ (tai nghe không dây, ốp lưng, dầu tóc) so với hành vi 2ep trên query tương tự.</w:t>
+      </w:r>
+    </w:p>
+    <w:p>
+      <w:pPr>
+        <w:pStyle w:val="ListBullet"/>
+        <w:rPr>
+          <w:rFonts w:ascii="Times New Roman" w:hAnsi="Times New Roman" w:cs="Times New Roman"/>
+          <w:sz w:val="28"/>
+          <w:szCs w:val="28"/>
+        </w:rPr>
+      </w:pPr>
+      <w:r>
+        <w:rPr>
+          <w:rFonts w:ascii="Times New Roman" w:hAnsi="Times New Roman" w:cs="Times New Roman"/>
+          <w:sz w:val="28"/>
+          <w:szCs w:val="28"/>
+        </w:rPr>
+        <w:t>Các lỗi pollution cứng (giày công nghiệp, máy sấy móng, tai nghe xe tải) vẫn còn — 180 triplets chưa phủ đủ ngành hàng và chưa thay thế normalize corpus.</w:t>
+      </w:r>
+    </w:p>
+    <w:p>
+      <w:pPr>
+        <w:pStyle w:val="ListBullet"/>
+        <w:rPr>
+          <w:rFonts w:ascii="Times New Roman" w:hAnsi="Times New Roman" w:cs="Times New Roman"/>
+          <w:sz w:val="28"/>
+          <w:szCs w:val="28"/>
+        </w:rPr>
+      </w:pPr>
+      <w:r>
+        <w:rPr>
+          <w:rFonts w:ascii="Times New Roman" w:hAnsi="Times New Roman" w:cs="Times New Roman"/>
+          <w:sz w:val="28"/>
+          <w:szCs w:val="28"/>
+        </w:rPr>
+        <w:t>Top-2/3 đôi khi đúng hơn top-1 (vd. earbud chống ồn ở rank 2–3 cho 'tai nghe bluetooth chống ồn').</w:t>
+      </w:r>
+    </w:p>
+    <w:p>
+      <w:pPr>
+        <w:pStyle w:val="ListBullet"/>
+        <w:rPr>
+          <w:rFonts w:ascii="Times New Roman" w:hAnsi="Times New Roman" w:cs="Times New Roman"/>
+          <w:sz w:val="28"/>
+          <w:szCs w:val="28"/>
+        </w:rPr>
+      </w:pPr>
+      <w:r>
+        <w:rPr>
+          <w:rFonts w:ascii="Times New Roman" w:hAnsi="Times New Roman" w:cs="Times New Roman"/>
+          <w:sz w:val="28"/>
+          <w:szCs w:val="28"/>
+        </w:rPr>
+        <w:t>Chưa có metric đầy đủ trên test_cleaned cho model triplet — cần eval formal + 78 query manual.</w:t>
+      </w:r>
+    </w:p>
+    <w:p>
+      <w:pPr>
+        <w:pStyle w:val="Heading2"/>
+        <w:rPr>
+          <w:rFonts w:ascii="Times New Roman" w:hAnsi="Times New Roman" w:cs="Times New Roman"/>
+          <w:color w:val="auto"/>
+          <w:sz w:val="28"/>
+          <w:szCs w:val="28"/>
+        </w:rPr>
+      </w:pPr>
+      <w:r>
+        <w:rPr>
+          <w:rFonts w:ascii="Times New Roman" w:hAnsi="Times New Roman" w:cs="Times New Roman"/>
+          <w:color w:val="auto"/>
+          <w:sz w:val="28"/>
+          <w:szCs w:val="28"/>
+        </w:rPr>
+        <w:lastRenderedPageBreak/>
+        <w:t>7.6. Hướng tiếp theo sau giai đoạn 2</w:t>
+      </w:r>
+    </w:p>
+    <w:p>
+      <w:pPr>
+        <w:pStyle w:val="ListBullet"/>
+        <w:rPr>
+          <w:rFonts w:ascii="Times New Roman" w:hAnsi="Times New Roman" w:cs="Times New Roman"/>
+          <w:sz w:val="28"/>
+          <w:szCs w:val="28"/>
+        </w:rPr>
+      </w:pPr>
+      <w:r>
+        <w:rPr>
+          <w:rFonts w:ascii="Times New Roman" w:hAnsi="Times New Roman" w:cs="Times New Roman"/>
+          <w:sz w:val="28"/>
+          <w:szCs w:val="28"/>
+        </w:rPr>
+        <w:t>Mở rộng triplets: nới score band hoặc mine thêm anchor; có thể dùng NVIDIA LLM filter false negative.</w:t>
+      </w:r>
+    </w:p>
+    <w:p>
+      <w:pPr>
+        <w:pStyle w:val="ListBullet"/>
+        <w:rPr>
+          <w:rFonts w:ascii="Times New Roman" w:hAnsi="Times New Roman" w:cs="Times New Roman"/>
+          <w:sz w:val="28"/>
+          <w:szCs w:val="28"/>
+        </w:rPr>
+      </w:pPr>
+      <w:r>
+        <w:rPr>
+          <w:rFonts w:ascii="Times New Roman" w:hAnsi="Times New Roman" w:cs="Times New Roman"/>
+          <w:sz w:val="28"/>
+          <w:szCs w:val="28"/>
+        </w:rPr>
+        <w:t>Eval A/B: 1ep vs 2ep vs triplet trên manual_eval_queries.csv (78 query).</w:t>
+      </w:r>
+    </w:p>
+    <w:p>
+      <w:pPr>
+        <w:pStyle w:val="ListBullet"/>
+        <w:rPr>
+          <w:rFonts w:ascii="Times New Roman" w:hAnsi="Times New Roman" w:cs="Times New Roman"/>
+          <w:sz w:val="28"/>
+          <w:szCs w:val="28"/>
+        </w:rPr>
+      </w:pPr>
+      <w:r>
+        <w:rPr>
+          <w:rFonts w:ascii="Times New Roman" w:hAnsi="Times New Roman" w:cs="Times New Roman"/>
+          <w:sz w:val="28"/>
+          <w:szCs w:val="28"/>
+        </w:rPr>
+        <w:t>Normalize searchable_text khi index (pet/industrial keyword) — không chỉ dựa train.</w:t>
+      </w:r>
+    </w:p>
+    <w:p>
+      <w:pPr>
+        <w:pStyle w:val="ListBullet"/>
+        <w:rPr>
+          <w:rFonts w:ascii="Times New Roman" w:hAnsi="Times New Roman" w:cs="Times New Roman"/>
+          <w:sz w:val="28"/>
+          <w:szCs w:val="28"/>
+        </w:rPr>
+      </w:pPr>
+      <w:r>
+        <w:rPr>
+          <w:rFonts w:ascii="Times New Roman" w:hAnsi="Times New Roman" w:cs="Times New Roman"/>
+          <w:sz w:val="28"/>
+          <w:szCs w:val="28"/>
+        </w:rPr>
+        <w:t>Hybrid retrieval + filter category tại Qdrant cho query mơ hồ.</w:t>
+      </w:r>
+    </w:p>
+    <w:p>
+      <w:pPr>
+        <w:pStyle w:val="Heading1"/>
+        <w:rPr>
+          <w:rFonts w:ascii="Times New Roman" w:hAnsi="Times New Roman" w:cs="Times New Roman"/>
+          <w:color w:val="auto"/>
+        </w:rPr>
+      </w:pPr>
+      <w:r>
+        <w:rPr>
+          <w:rFonts w:ascii="Times New Roman" w:hAnsi="Times New Roman" w:cs="Times New Roman"/>
+          <w:color w:val="auto"/>
+        </w:rPr>
+        <w:t>8. Kết luận và khuyến nghị</w:t>
       </w:r>
     </w:p>
     <w:p>
@@ -3393,7 +5395,25 @@
           <w:sz w:val="28"/>
           <w:szCs w:val="28"/>
         </w:rPr>
-        <w:t>Ưu tiên tiếp theo: (1) audit/làm sạch train, (2) hard negative theo category, (3) normalize corpus khi index, (4) bộ eval ~20 query + category pollution theo ngành.</w:t>
+        <w:t>Giai đoạn 2 đã triển khai: làm sạch train v2, mine hard negative v2 (180 triplets), TripletLoss từ 1ep, index Qdrant products_vi_e5_triplet — xem Mục 7.</w:t>
+      </w:r>
+    </w:p>
+    <w:p>
+      <w:pPr>
+        <w:pStyle w:val="ListBullet"/>
+        <w:rPr>
+          <w:rFonts w:ascii="Times New Roman" w:hAnsi="Times New Roman" w:cs="Times New Roman"/>
+          <w:sz w:val="28"/>
+          <w:szCs w:val="28"/>
+        </w:rPr>
+      </w:pPr>
+      <w:r>
+        <w:rPr>
+          <w:rFonts w:ascii="Times New Roman" w:hAnsi="Times New Roman" w:cs="Times New Roman"/>
+          <w:sz w:val="28"/>
+          <w:szCs w:val="28"/>
+        </w:rPr>
+        <w:t>Ưu tiên tiếp theo: (1) eval formal triplet vs 1ep/2ep, (2) mở rộng triplets + LLM filter, (3) normalize corpus khi index, (4) hybrid/category filter tại retrieval.</w:t>
       </w:r>
     </w:p>
     <w:p>
@@ -3417,10 +5437,6 @@
     <w:p>
       <w:pPr>
         <w:pStyle w:val="ListBullet"/>
-        <w:numPr>
-          <w:ilvl w:val="0"/>
-          <w:numId w:val="0"/>
-        </w:numPr>
         <w:rPr>
           <w:rFonts w:ascii="Times New Roman" w:hAnsi="Times New Roman" w:cs="Times New Roman"/>
           <w:sz w:val="28"/>
@@ -3611,31 +5627,31 @@
       </w:rPr>
     </w:lvl>
   </w:abstractNum>
-  <w:num w:numId="1" w16cid:durableId="320549199">
+  <w:num w:numId="1" w16cid:durableId="1300064485">
     <w:abstractNumId w:val="8"/>
   </w:num>
-  <w:num w:numId="2" w16cid:durableId="375470564">
+  <w:num w:numId="2" w16cid:durableId="708342462">
     <w:abstractNumId w:val="6"/>
   </w:num>
-  <w:num w:numId="3" w16cid:durableId="1759786398">
+  <w:num w:numId="3" w16cid:durableId="222369987">
     <w:abstractNumId w:val="5"/>
   </w:num>
-  <w:num w:numId="4" w16cid:durableId="1349719332">
+  <w:num w:numId="4" w16cid:durableId="432944498">
     <w:abstractNumId w:val="4"/>
   </w:num>
-  <w:num w:numId="5" w16cid:durableId="1169254828">
+  <w:num w:numId="5" w16cid:durableId="1378042103">
     <w:abstractNumId w:val="7"/>
   </w:num>
-  <w:num w:numId="6" w16cid:durableId="912936817">
+  <w:num w:numId="6" w16cid:durableId="1890264569">
     <w:abstractNumId w:val="3"/>
   </w:num>
-  <w:num w:numId="7" w16cid:durableId="1361323526">
+  <w:num w:numId="7" w16cid:durableId="1309822918">
     <w:abstractNumId w:val="2"/>
   </w:num>
-  <w:num w:numId="8" w16cid:durableId="2108037729">
+  <w:num w:numId="8" w16cid:durableId="109397414">
     <w:abstractNumId w:val="1"/>
   </w:num>
-  <w:num w:numId="9" w16cid:durableId="1712803239">
+  <w:num w:numId="9" w16cid:durableId="364713915">
     <w:abstractNumId w:val="0"/>
   </w:num>
 </w:numbering>

</xml_diff>